<commit_message>
task 1 feat: add tech openMP feat: add cycle for multiple measurements of the same experiment
</commit_message>
<xml_diff>
--- a/lab_1/Отчет №1.docx
+++ b/lab_1/Отчет №1.docx
@@ -493,7 +493,17 @@
           <w:sz w:val="28"/>
           <w:szCs w:val="28"/>
         </w:rPr>
-        <w:t>В ходе выполнения работы была написана программа для вычисления произведения двух матриц, был написан скрипт для проверки результатов вычислений.</w:t>
+        <w:t>В ходе выполнения работы была написана программа для вычисления произведения двух матриц,</w:t>
+      </w:r>
+      <w:bookmarkStart w:id="0" w:name="_GoBack"/>
+      <w:bookmarkEnd w:id="0"/>
+      <w:r>
+        <w:rPr>
+          <w:rFonts w:ascii="Times New Roman" w:hAnsi="Times New Roman" w:cs="Times New Roman"/>
+          <w:sz w:val="28"/>
+          <w:szCs w:val="28"/>
+        </w:rPr>
+        <w:t xml:space="preserve"> скрипт для проверки результатов вычислений.</w:t>
       </w:r>
     </w:p>
     <w:tbl>
@@ -1243,8 +1253,6 @@
         </w:rPr>
         <w:t>.</w:t>
       </w:r>
-      <w:bookmarkStart w:id="0" w:name="_GoBack"/>
-      <w:bookmarkEnd w:id="0"/>
     </w:p>
     <w:sectPr>
       <w:pgSz w:w="11906" w:h="16838"/>

</xml_diff>